<commit_message>
Update docs with live url
</commit_message>
<xml_diff>
--- a/docs/CreditRisk_AI_Project_Report.docx
+++ b/docs/CreditRisk_AI_Project_Report.docx
@@ -299,6 +299,31 @@
           <w:sz w:val="24"/>
         </w:rPr>
         <w:t>OCTOBER--2026</w:t>
+      </w:r>
+    </w:p>
+    <w:p>
+      <w:pPr>
+        <w:jc w:val="center"/>
+      </w:pPr>
+      <w:r>
+        <w:rPr>
+          <w:b/>
+          <w:color w:val="006699"/>
+          <w:sz w:val="21"/>
+        </w:rPr>
+        <w:t>🌐 Live Deployed Application URL:</w:t>
+        <w:br/>
+      </w:r>
+      <w:r>
+        <w:rPr>
+          <w:b/>
+          <w:color w:val="0284C7"/>
+          <w:sz w:val="20"/>
+          <w:u w:val="single"/>
+        </w:rPr>
+        <w:t>https://creditrisk-ai-whg2pxi4s9qsezatdpsxxh.streamlit.app/</w:t>
+        <w:br/>
+        <w:br/>
       </w:r>
     </w:p>
     <w:p>

</xml_diff>